<commit_message>
fix(medicine): acknowledgement letter names the requesting party, not the client
The acknowledgement always printed the client's own name even when a
different requesting party/conforme (e.g. a family member who actually
picked up the medicine) was recorded on the case. Swapped the
clientName placeholder for conformeName, which already resolves to
the requesting party when set and falls back to the client's name
otherwise, matching how other case documents handle this.

Co-Authored-By: Claude Sonnet 5 <noreply@anthropic.com>
</commit_message>
<xml_diff>
--- a/templates/medicine-acknowledgement.fixed.docx
+++ b/templates/medicine-acknowledgement.fixed.docx
@@ -148,7 +148,7 @@
           <w:szCs w:val="24"/>
           <w:u w:val="single"/>
         </w:rPr>
-        <w:t>clientName</w:t>
+        <w:t>conformeName</w:t>
       </w:r>
       <w:proofErr w:type="spellEnd"/>
       <w:r>
@@ -531,7 +531,7 @@
           <w:szCs w:val="24"/>
           <w:u w:val="single"/>
         </w:rPr>
-        <w:t>clientName</w:t>
+        <w:t>conformeName</w:t>
       </w:r>
       <w:proofErr w:type="spellEnd"/>
       <w:r>

</xml_diff>